<commit_message>
docs: finalize submission writeup and evaluation status
</commit_message>
<xml_diff>
--- a/submission/asset-intelligence-writeup.docx
+++ b/submission/asset-intelligence-writeup.docx
@@ -272,7 +272,6 @@
     <w:p>
       <w:pPr>
         <w:spacing w:after="75"/>
-        <w:pageBreakBefore/>
       </w:pPr>
       <w:r>
         <w:rPr>
@@ -283,7 +282,7 @@
           <w:spacing w:val="0"/>
           <w:color w:val="11192A"/>
         </w:rPr>
-        <w:t xml:space="preserve">Saved answers and results</w:t>
+        <w:t xml:space="preserve">Evaluation results and limits</w:t>
       </w:r>
     </w:p>
     <w:p>
@@ -295,10 +294,21 @@
           <w:rFonts w:ascii="Arial" w:hAnsi="Arial" w:cs="Arial"/>
           <w:sz w:val="21"/>
           <w:sz-cs w:val="21"/>
+          <w:b/>
+          <w:spacing w:val="0"/>
+          <w:color w:val="0E2138"/>
+        </w:rPr>
+        <w:t xml:space="preserve">Updated pipeline run in progress:</w:t>
+      </w:r>
+      <w:r>
+        <w:rPr>
+          <w:rFonts w:ascii="Arial" w:hAnsi="Arial" w:cs="Arial"/>
+          <w:sz w:val="21"/>
+          <w:sz-cs w:val="21"/>
           <w:spacing w:val="0"/>
           <w:color w:val="415267"/>
         </w:rPr>
-        <w:t xml:space="preserve">E4 captured 21 turns: 12 HTTP 200 partials and 9 HTTP 502 upstream errors; no 504s. Ten partials hit the context limit. Two turns returned evidence-supported answers (2/21 answer coverage, not an accuracy rate); the other 19 were unverifiable.</w:t>
+        <w:t xml:space="preserve"> 16/21 turns attempted as of 17 Oct 2026: 11 HTTP 200 partials, 4 HTTP 502 errors, 1 request pending. Partial HTTP success does not establish correctness; these new answers have not yet completed evidence review. The table below reports the separate, completed E4 run.</w:t>
       </w:r>
     </w:p>
     <w:p>
@@ -326,7 +336,7 @@
           <w:spacing w:val="0"/>
           <w:color w:val="FFFFFF"/>
         </w:rPr>
-        <w:t xml:space="preserve">Saved answer or failure</w:t>
+        <w:t xml:space="preserve">Earlier full run (E4)</w:t>
       </w:r>
     </w:p>
     <w:p>
@@ -783,7 +793,7 @@
           <w:spacing w:val="0"/>
           <w:color w:val="0E2138"/>
         </w:rPr>
-        <w:t xml:space="preserve">Follow-up:</w:t>
+        <w:t xml:space="preserve">E4 result:</w:t>
       </w:r>
       <w:r>
         <w:rPr>
@@ -793,7 +803,7 @@
           <w:spacing w:val="0"/>
           <w:color w:val="11192A"/>
         </w:rPr>
-        <w:t xml:space="preserve"> Q1 refusal and Q9-2 (Nathan Pierce, 150 wells) were the only supported answers. Q9-2 had four saved-query citations. Q9-4 had no answer: source oracle confirms no Dec 3 H2S reading; latest prior reading is 0 ppm on Nov 20. Oracle counts shown above are reference only, not model output.</w:t>
+        <w:t xml:space="preserve"> Q1 refusal and Q9-2 (Nathan Pierce, 150 wells) were the only supported answers: 2/21 verified answer coverage, not an accuracy rate. Q9-2 had four saved-query citations. Q9-4 had no answer; source records contain no Dec 3 H2S reading. Oracle counts above are reference checks, not model outputs.</w:t>
       </w:r>
     </w:p>
     <w:p>
@@ -817,7 +827,7 @@
           <w:spacing w:val="0"/>
           <w:color w:val="11192A"/>
         </w:rPr>
-        <w:t xml:space="preserve"> The other 19 turns had no verifiable answer. Usage is a lower bound (1,740,380 tokens across 103 served-model IDs); no cost total is stated. Full prompts/responses stay private and are not included here. </w:t>
+        <w:t xml:space="preserve"> E4’s other 19 turns were unverifiable. It recorded at least 1,740,380 tokens; no cost total is stated. Full runtime conversations remain private. </w:t>
       </w:r>
       <w:r>
         <w:rPr>
@@ -827,7 +837,7 @@
           <w:spacing w:val="0"/>
           <w:color w:val="155499"/>
         </w:rPr>
-        <w:t xml:space="preserve">Public E4 rerun report</w:t>
+        <w:t xml:space="preserve">E4 report</w:t>
       </w:r>
       <w:r>
         <w:rPr>
@@ -847,7 +857,7 @@
           <w:spacing w:val="0"/>
           <w:color w:val="155499"/>
         </w:rPr>
-        <w:t xml:space="preserve">source oracle</w:t>
+        <w:t xml:space="preserve">source checks</w:t>
       </w:r>
       <w:r>
         <w:rPr>
@@ -870,7 +880,7 @@
           <w:spacing w:val="0"/>
           <w:color w:val="4F5E73"/>
         </w:rPr>
-        <w:t xml:space="preserve">Full private capture remains in the local evaluation workspace; no conversations or private DBs published.</w:t>
+        <w:t xml:space="preserve">Private captures and databases are excluded.</w:t>
       </w:r>
     </w:p>
     <w:p>
@@ -883,7 +893,7 @@
           <w:spacing w:val="0"/>
           <w:color w:val="4F5E73"/>
         </w:rPr>
-        <w:t xml:space="preserve">11 scenarios · 21 turns · no full scenario returned a complete answer</w:t>
+        <w:t xml:space="preserve">E4: 21 turns · no complete scenario</w:t>
       </w:r>
     </w:p>
     <w:sectPr>

</xml_diff>